<commit_message>
docs: finalize label reconstruction roadmap and handoff
</commit_message>
<xml_diff>
--- a/docs/proposals/2026-08-16-tpeng-label-system-reconstruction-business-brief.docx
+++ b/docs/proposals/2026-08-16-tpeng-label-system-reconstruction-business-brief.docx
@@ -5,11 +5,12 @@
     <w:p>
       <w:pPr>
         <w:spacing w:before="0" w:after="0" w:line="240" w:lineRule="auto"/>
+        <w:jc w:val="center"/>
       </w:pPr>
       <w:r>
         <w:drawing>
           <wp:inline xmlns:a="http://schemas.openxmlformats.org/drawingml/2006/main" xmlns:pic="http://schemas.openxmlformats.org/drawingml/2006/picture">
-            <wp:extent cx="7772400" cy="10058400"/>
+            <wp:extent cx="7543800" cy="9762565"/>
             <wp:docPr id="1" name="Picture 1"/>
             <wp:cNvGraphicFramePr>
               <a:graphicFrameLocks noChangeAspect="1"/>
@@ -18,7 +19,7 @@
               <a:graphicData uri="http://schemas.openxmlformats.org/drawingml/2006/picture">
                 <pic:pic>
                   <pic:nvPicPr>
-                    <pic:cNvPr id="0" name="page-1.png"/>
+                    <pic:cNvPr id="0" name="page-01.png"/>
                     <pic:cNvPicPr/>
                   </pic:nvPicPr>
                   <pic:blipFill>
@@ -30,7 +31,7 @@
                   <pic:spPr>
                     <a:xfrm>
                       <a:off x="0" y="0"/>
-                      <a:ext cx="7772400" cy="10058400"/>
+                      <a:ext cx="7543800" cy="9762565"/>
                     </a:xfrm>
                     <a:prstGeom prst="rect"/>
                   </pic:spPr>
@@ -40,18 +41,22 @@
           </wp:inline>
         </w:drawing>
       </w:r>
-      <w:r>
-        <w:br w:type="page"/>
-      </w:r>
+    </w:p>
+    <w:p>
+      <w:pPr>
+        <w:pageBreakBefore/>
+        <w:spacing w:before="0" w:after="0" w:line="240" w:lineRule="auto"/>
+      </w:pPr>
     </w:p>
     <w:p>
       <w:pPr>
         <w:spacing w:before="0" w:after="0" w:line="240" w:lineRule="auto"/>
+        <w:jc w:val="center"/>
       </w:pPr>
       <w:r>
         <w:drawing>
           <wp:inline xmlns:a="http://schemas.openxmlformats.org/drawingml/2006/main" xmlns:pic="http://schemas.openxmlformats.org/drawingml/2006/picture">
-            <wp:extent cx="7772400" cy="10058400"/>
+            <wp:extent cx="7543800" cy="9762565"/>
             <wp:docPr id="2" name="Picture 2"/>
             <wp:cNvGraphicFramePr>
               <a:graphicFrameLocks noChangeAspect="1"/>
@@ -60,7 +65,7 @@
               <a:graphicData uri="http://schemas.openxmlformats.org/drawingml/2006/picture">
                 <pic:pic>
                   <pic:nvPicPr>
-                    <pic:cNvPr id="0" name="page-2.png"/>
+                    <pic:cNvPr id="0" name="page-02.png"/>
                     <pic:cNvPicPr/>
                   </pic:nvPicPr>
                   <pic:blipFill>
@@ -72,7 +77,7 @@
                   <pic:spPr>
                     <a:xfrm>
                       <a:off x="0" y="0"/>
-                      <a:ext cx="7772400" cy="10058400"/>
+                      <a:ext cx="7543800" cy="9762565"/>
                     </a:xfrm>
                     <a:prstGeom prst="rect"/>
                   </pic:spPr>
@@ -82,18 +87,22 @@
           </wp:inline>
         </w:drawing>
       </w:r>
-      <w:r>
-        <w:br w:type="page"/>
-      </w:r>
+    </w:p>
+    <w:p>
+      <w:pPr>
+        <w:pageBreakBefore/>
+        <w:spacing w:before="0" w:after="0" w:line="240" w:lineRule="auto"/>
+      </w:pPr>
     </w:p>
     <w:p>
       <w:pPr>
         <w:spacing w:before="0" w:after="0" w:line="240" w:lineRule="auto"/>
+        <w:jc w:val="center"/>
       </w:pPr>
       <w:r>
         <w:drawing>
           <wp:inline xmlns:a="http://schemas.openxmlformats.org/drawingml/2006/main" xmlns:pic="http://schemas.openxmlformats.org/drawingml/2006/picture">
-            <wp:extent cx="7772400" cy="10058400"/>
+            <wp:extent cx="7543800" cy="9762565"/>
             <wp:docPr id="3" name="Picture 3"/>
             <wp:cNvGraphicFramePr>
               <a:graphicFrameLocks noChangeAspect="1"/>
@@ -102,7 +111,7 @@
               <a:graphicData uri="http://schemas.openxmlformats.org/drawingml/2006/picture">
                 <pic:pic>
                   <pic:nvPicPr>
-                    <pic:cNvPr id="0" name="page-3.png"/>
+                    <pic:cNvPr id="0" name="page-03.png"/>
                     <pic:cNvPicPr/>
                   </pic:nvPicPr>
                   <pic:blipFill>
@@ -114,7 +123,7 @@
                   <pic:spPr>
                     <a:xfrm>
                       <a:off x="0" y="0"/>
-                      <a:ext cx="7772400" cy="10058400"/>
+                      <a:ext cx="7543800" cy="9762565"/>
                     </a:xfrm>
                     <a:prstGeom prst="rect"/>
                   </pic:spPr>
@@ -124,18 +133,22 @@
           </wp:inline>
         </w:drawing>
       </w:r>
-      <w:r>
-        <w:br w:type="page"/>
-      </w:r>
+    </w:p>
+    <w:p>
+      <w:pPr>
+        <w:pageBreakBefore/>
+        <w:spacing w:before="0" w:after="0" w:line="240" w:lineRule="auto"/>
+      </w:pPr>
     </w:p>
     <w:p>
       <w:pPr>
         <w:spacing w:before="0" w:after="0" w:line="240" w:lineRule="auto"/>
+        <w:jc w:val="center"/>
       </w:pPr>
       <w:r>
         <w:drawing>
           <wp:inline xmlns:a="http://schemas.openxmlformats.org/drawingml/2006/main" xmlns:pic="http://schemas.openxmlformats.org/drawingml/2006/picture">
-            <wp:extent cx="7772400" cy="10058400"/>
+            <wp:extent cx="7543800" cy="9762565"/>
             <wp:docPr id="4" name="Picture 4"/>
             <wp:cNvGraphicFramePr>
               <a:graphicFrameLocks noChangeAspect="1"/>
@@ -144,7 +157,7 @@
               <a:graphicData uri="http://schemas.openxmlformats.org/drawingml/2006/picture">
                 <pic:pic>
                   <pic:nvPicPr>
-                    <pic:cNvPr id="0" name="page-4.png"/>
+                    <pic:cNvPr id="0" name="page-04.png"/>
                     <pic:cNvPicPr/>
                   </pic:nvPicPr>
                   <pic:blipFill>
@@ -156,7 +169,7 @@
                   <pic:spPr>
                     <a:xfrm>
                       <a:off x="0" y="0"/>
-                      <a:ext cx="7772400" cy="10058400"/>
+                      <a:ext cx="7543800" cy="9762565"/>
                     </a:xfrm>
                     <a:prstGeom prst="rect"/>
                   </pic:spPr>
@@ -166,18 +179,22 @@
           </wp:inline>
         </w:drawing>
       </w:r>
-      <w:r>
-        <w:br w:type="page"/>
-      </w:r>
+    </w:p>
+    <w:p>
+      <w:pPr>
+        <w:pageBreakBefore/>
+        <w:spacing w:before="0" w:after="0" w:line="240" w:lineRule="auto"/>
+      </w:pPr>
     </w:p>
     <w:p>
       <w:pPr>
         <w:spacing w:before="0" w:after="0" w:line="240" w:lineRule="auto"/>
+        <w:jc w:val="center"/>
       </w:pPr>
       <w:r>
         <w:drawing>
           <wp:inline xmlns:a="http://schemas.openxmlformats.org/drawingml/2006/main" xmlns:pic="http://schemas.openxmlformats.org/drawingml/2006/picture">
-            <wp:extent cx="7772400" cy="10058400"/>
+            <wp:extent cx="7543800" cy="9762565"/>
             <wp:docPr id="5" name="Picture 5"/>
             <wp:cNvGraphicFramePr>
               <a:graphicFrameLocks noChangeAspect="1"/>
@@ -186,7 +203,7 @@
               <a:graphicData uri="http://schemas.openxmlformats.org/drawingml/2006/picture">
                 <pic:pic>
                   <pic:nvPicPr>
-                    <pic:cNvPr id="0" name="page-5.png"/>
+                    <pic:cNvPr id="0" name="page-05.png"/>
                     <pic:cNvPicPr/>
                   </pic:nvPicPr>
                   <pic:blipFill>
@@ -198,7 +215,7 @@
                   <pic:spPr>
                     <a:xfrm>
                       <a:off x="0" y="0"/>
-                      <a:ext cx="7772400" cy="10058400"/>
+                      <a:ext cx="7543800" cy="9762565"/>
                     </a:xfrm>
                     <a:prstGeom prst="rect"/>
                   </pic:spPr>
@@ -208,18 +225,22 @@
           </wp:inline>
         </w:drawing>
       </w:r>
-      <w:r>
-        <w:br w:type="page"/>
-      </w:r>
+    </w:p>
+    <w:p>
+      <w:pPr>
+        <w:pageBreakBefore/>
+        <w:spacing w:before="0" w:after="0" w:line="240" w:lineRule="auto"/>
+      </w:pPr>
     </w:p>
     <w:p>
       <w:pPr>
         <w:spacing w:before="0" w:after="0" w:line="240" w:lineRule="auto"/>
+        <w:jc w:val="center"/>
       </w:pPr>
       <w:r>
         <w:drawing>
           <wp:inline xmlns:a="http://schemas.openxmlformats.org/drawingml/2006/main" xmlns:pic="http://schemas.openxmlformats.org/drawingml/2006/picture">
-            <wp:extent cx="7772400" cy="10058400"/>
+            <wp:extent cx="7543800" cy="9762565"/>
             <wp:docPr id="6" name="Picture 6"/>
             <wp:cNvGraphicFramePr>
               <a:graphicFrameLocks noChangeAspect="1"/>
@@ -228,7 +249,7 @@
               <a:graphicData uri="http://schemas.openxmlformats.org/drawingml/2006/picture">
                 <pic:pic>
                   <pic:nvPicPr>
-                    <pic:cNvPr id="0" name="page-6.png"/>
+                    <pic:cNvPr id="0" name="page-06.png"/>
                     <pic:cNvPicPr/>
                   </pic:nvPicPr>
                   <pic:blipFill>
@@ -240,7 +261,7 @@
                   <pic:spPr>
                     <a:xfrm>
                       <a:off x="0" y="0"/>
-                      <a:ext cx="7772400" cy="10058400"/>
+                      <a:ext cx="7543800" cy="9762565"/>
                     </a:xfrm>
                     <a:prstGeom prst="rect"/>
                   </pic:spPr>
@@ -250,18 +271,22 @@
           </wp:inline>
         </w:drawing>
       </w:r>
-      <w:r>
-        <w:br w:type="page"/>
-      </w:r>
+    </w:p>
+    <w:p>
+      <w:pPr>
+        <w:pageBreakBefore/>
+        <w:spacing w:before="0" w:after="0" w:line="240" w:lineRule="auto"/>
+      </w:pPr>
     </w:p>
     <w:p>
       <w:pPr>
         <w:spacing w:before="0" w:after="0" w:line="240" w:lineRule="auto"/>
+        <w:jc w:val="center"/>
       </w:pPr>
       <w:r>
         <w:drawing>
           <wp:inline xmlns:a="http://schemas.openxmlformats.org/drawingml/2006/main" xmlns:pic="http://schemas.openxmlformats.org/drawingml/2006/picture">
-            <wp:extent cx="7772400" cy="10058400"/>
+            <wp:extent cx="7543800" cy="9762565"/>
             <wp:docPr id="7" name="Picture 7"/>
             <wp:cNvGraphicFramePr>
               <a:graphicFrameLocks noChangeAspect="1"/>
@@ -270,7 +295,7 @@
               <a:graphicData uri="http://schemas.openxmlformats.org/drawingml/2006/picture">
                 <pic:pic>
                   <pic:nvPicPr>
-                    <pic:cNvPr id="0" name="page-7.png"/>
+                    <pic:cNvPr id="0" name="page-07.png"/>
                     <pic:cNvPicPr/>
                   </pic:nvPicPr>
                   <pic:blipFill>
@@ -282,7 +307,7 @@
                   <pic:spPr>
                     <a:xfrm>
                       <a:off x="0" y="0"/>
-                      <a:ext cx="7772400" cy="10058400"/>
+                      <a:ext cx="7543800" cy="9762565"/>
                     </a:xfrm>
                     <a:prstGeom prst="rect"/>
                   </pic:spPr>
@@ -292,18 +317,22 @@
           </wp:inline>
         </w:drawing>
       </w:r>
-      <w:r>
-        <w:br w:type="page"/>
-      </w:r>
+    </w:p>
+    <w:p>
+      <w:pPr>
+        <w:pageBreakBefore/>
+        <w:spacing w:before="0" w:after="0" w:line="240" w:lineRule="auto"/>
+      </w:pPr>
     </w:p>
     <w:p>
       <w:pPr>
         <w:spacing w:before="0" w:after="0" w:line="240" w:lineRule="auto"/>
+        <w:jc w:val="center"/>
       </w:pPr>
       <w:r>
         <w:drawing>
           <wp:inline xmlns:a="http://schemas.openxmlformats.org/drawingml/2006/main" xmlns:pic="http://schemas.openxmlformats.org/drawingml/2006/picture">
-            <wp:extent cx="7772400" cy="10058400"/>
+            <wp:extent cx="7543800" cy="9762565"/>
             <wp:docPr id="8" name="Picture 8"/>
             <wp:cNvGraphicFramePr>
               <a:graphicFrameLocks noChangeAspect="1"/>
@@ -312,7 +341,7 @@
               <a:graphicData uri="http://schemas.openxmlformats.org/drawingml/2006/picture">
                 <pic:pic>
                   <pic:nvPicPr>
-                    <pic:cNvPr id="0" name="page-8.png"/>
+                    <pic:cNvPr id="0" name="page-08.png"/>
                     <pic:cNvPicPr/>
                   </pic:nvPicPr>
                   <pic:blipFill>
@@ -324,7 +353,237 @@
                   <pic:spPr>
                     <a:xfrm>
                       <a:off x="0" y="0"/>
-                      <a:ext cx="7772400" cy="10058400"/>
+                      <a:ext cx="7543800" cy="9762565"/>
+                    </a:xfrm>
+                    <a:prstGeom prst="rect"/>
+                  </pic:spPr>
+                </pic:pic>
+              </a:graphicData>
+            </a:graphic>
+          </wp:inline>
+        </w:drawing>
+      </w:r>
+    </w:p>
+    <w:p>
+      <w:pPr>
+        <w:pageBreakBefore/>
+        <w:spacing w:before="0" w:after="0" w:line="240" w:lineRule="auto"/>
+      </w:pPr>
+    </w:p>
+    <w:p>
+      <w:pPr>
+        <w:spacing w:before="0" w:after="0" w:line="240" w:lineRule="auto"/>
+        <w:jc w:val="center"/>
+      </w:pPr>
+      <w:r>
+        <w:drawing>
+          <wp:inline xmlns:a="http://schemas.openxmlformats.org/drawingml/2006/main" xmlns:pic="http://schemas.openxmlformats.org/drawingml/2006/picture">
+            <wp:extent cx="7543800" cy="9762565"/>
+            <wp:docPr id="9" name="Picture 9"/>
+            <wp:cNvGraphicFramePr>
+              <a:graphicFrameLocks noChangeAspect="1"/>
+            </wp:cNvGraphicFramePr>
+            <a:graphic>
+              <a:graphicData uri="http://schemas.openxmlformats.org/drawingml/2006/picture">
+                <pic:pic>
+                  <pic:nvPicPr>
+                    <pic:cNvPr id="0" name="page-09.png"/>
+                    <pic:cNvPicPr/>
+                  </pic:nvPicPr>
+                  <pic:blipFill>
+                    <a:blip r:embed="rId17"/>
+                    <a:stretch>
+                      <a:fillRect/>
+                    </a:stretch>
+                  </pic:blipFill>
+                  <pic:spPr>
+                    <a:xfrm>
+                      <a:off x="0" y="0"/>
+                      <a:ext cx="7543800" cy="9762565"/>
+                    </a:xfrm>
+                    <a:prstGeom prst="rect"/>
+                  </pic:spPr>
+                </pic:pic>
+              </a:graphicData>
+            </a:graphic>
+          </wp:inline>
+        </w:drawing>
+      </w:r>
+    </w:p>
+    <w:p>
+      <w:pPr>
+        <w:pageBreakBefore/>
+        <w:spacing w:before="0" w:after="0" w:line="240" w:lineRule="auto"/>
+      </w:pPr>
+    </w:p>
+    <w:p>
+      <w:pPr>
+        <w:spacing w:before="0" w:after="0" w:line="240" w:lineRule="auto"/>
+        <w:jc w:val="center"/>
+      </w:pPr>
+      <w:r>
+        <w:drawing>
+          <wp:inline xmlns:a="http://schemas.openxmlformats.org/drawingml/2006/main" xmlns:pic="http://schemas.openxmlformats.org/drawingml/2006/picture">
+            <wp:extent cx="7543800" cy="9762565"/>
+            <wp:docPr id="10" name="Picture 10"/>
+            <wp:cNvGraphicFramePr>
+              <a:graphicFrameLocks noChangeAspect="1"/>
+            </wp:cNvGraphicFramePr>
+            <a:graphic>
+              <a:graphicData uri="http://schemas.openxmlformats.org/drawingml/2006/picture">
+                <pic:pic>
+                  <pic:nvPicPr>
+                    <pic:cNvPr id="0" name="page-10.png"/>
+                    <pic:cNvPicPr/>
+                  </pic:nvPicPr>
+                  <pic:blipFill>
+                    <a:blip r:embed="rId18"/>
+                    <a:stretch>
+                      <a:fillRect/>
+                    </a:stretch>
+                  </pic:blipFill>
+                  <pic:spPr>
+                    <a:xfrm>
+                      <a:off x="0" y="0"/>
+                      <a:ext cx="7543800" cy="9762565"/>
+                    </a:xfrm>
+                    <a:prstGeom prst="rect"/>
+                  </pic:spPr>
+                </pic:pic>
+              </a:graphicData>
+            </a:graphic>
+          </wp:inline>
+        </w:drawing>
+      </w:r>
+    </w:p>
+    <w:p>
+      <w:pPr>
+        <w:pageBreakBefore/>
+        <w:spacing w:before="0" w:after="0" w:line="240" w:lineRule="auto"/>
+      </w:pPr>
+    </w:p>
+    <w:p>
+      <w:pPr>
+        <w:spacing w:before="0" w:after="0" w:line="240" w:lineRule="auto"/>
+        <w:jc w:val="center"/>
+      </w:pPr>
+      <w:r>
+        <w:drawing>
+          <wp:inline xmlns:a="http://schemas.openxmlformats.org/drawingml/2006/main" xmlns:pic="http://schemas.openxmlformats.org/drawingml/2006/picture">
+            <wp:extent cx="7543800" cy="9762565"/>
+            <wp:docPr id="11" name="Picture 11"/>
+            <wp:cNvGraphicFramePr>
+              <a:graphicFrameLocks noChangeAspect="1"/>
+            </wp:cNvGraphicFramePr>
+            <a:graphic>
+              <a:graphicData uri="http://schemas.openxmlformats.org/drawingml/2006/picture">
+                <pic:pic>
+                  <pic:nvPicPr>
+                    <pic:cNvPr id="0" name="page-11.png"/>
+                    <pic:cNvPicPr/>
+                  </pic:nvPicPr>
+                  <pic:blipFill>
+                    <a:blip r:embed="rId19"/>
+                    <a:stretch>
+                      <a:fillRect/>
+                    </a:stretch>
+                  </pic:blipFill>
+                  <pic:spPr>
+                    <a:xfrm>
+                      <a:off x="0" y="0"/>
+                      <a:ext cx="7543800" cy="9762565"/>
+                    </a:xfrm>
+                    <a:prstGeom prst="rect"/>
+                  </pic:spPr>
+                </pic:pic>
+              </a:graphicData>
+            </a:graphic>
+          </wp:inline>
+        </w:drawing>
+      </w:r>
+    </w:p>
+    <w:p>
+      <w:pPr>
+        <w:pageBreakBefore/>
+        <w:spacing w:before="0" w:after="0" w:line="240" w:lineRule="auto"/>
+      </w:pPr>
+    </w:p>
+    <w:p>
+      <w:pPr>
+        <w:spacing w:before="0" w:after="0" w:line="240" w:lineRule="auto"/>
+        <w:jc w:val="center"/>
+      </w:pPr>
+      <w:r>
+        <w:drawing>
+          <wp:inline xmlns:a="http://schemas.openxmlformats.org/drawingml/2006/main" xmlns:pic="http://schemas.openxmlformats.org/drawingml/2006/picture">
+            <wp:extent cx="7543800" cy="9762565"/>
+            <wp:docPr id="12" name="Picture 12"/>
+            <wp:cNvGraphicFramePr>
+              <a:graphicFrameLocks noChangeAspect="1"/>
+            </wp:cNvGraphicFramePr>
+            <a:graphic>
+              <a:graphicData uri="http://schemas.openxmlformats.org/drawingml/2006/picture">
+                <pic:pic>
+                  <pic:nvPicPr>
+                    <pic:cNvPr id="0" name="page-12.png"/>
+                    <pic:cNvPicPr/>
+                  </pic:nvPicPr>
+                  <pic:blipFill>
+                    <a:blip r:embed="rId20"/>
+                    <a:stretch>
+                      <a:fillRect/>
+                    </a:stretch>
+                  </pic:blipFill>
+                  <pic:spPr>
+                    <a:xfrm>
+                      <a:off x="0" y="0"/>
+                      <a:ext cx="7543800" cy="9762565"/>
+                    </a:xfrm>
+                    <a:prstGeom prst="rect"/>
+                  </pic:spPr>
+                </pic:pic>
+              </a:graphicData>
+            </a:graphic>
+          </wp:inline>
+        </w:drawing>
+      </w:r>
+    </w:p>
+    <w:p>
+      <w:pPr>
+        <w:pageBreakBefore/>
+        <w:spacing w:before="0" w:after="0" w:line="240" w:lineRule="auto"/>
+      </w:pPr>
+    </w:p>
+    <w:p>
+      <w:pPr>
+        <w:spacing w:before="0" w:after="0" w:line="240" w:lineRule="auto"/>
+        <w:jc w:val="center"/>
+      </w:pPr>
+      <w:r>
+        <w:drawing>
+          <wp:inline xmlns:a="http://schemas.openxmlformats.org/drawingml/2006/main" xmlns:pic="http://schemas.openxmlformats.org/drawingml/2006/picture">
+            <wp:extent cx="7543800" cy="9762565"/>
+            <wp:docPr id="13" name="Picture 13"/>
+            <wp:cNvGraphicFramePr>
+              <a:graphicFrameLocks noChangeAspect="1"/>
+            </wp:cNvGraphicFramePr>
+            <a:graphic>
+              <a:graphicData uri="http://schemas.openxmlformats.org/drawingml/2006/picture">
+                <pic:pic>
+                  <pic:nvPicPr>
+                    <pic:cNvPr id="0" name="page-13.png"/>
+                    <pic:cNvPicPr/>
+                  </pic:nvPicPr>
+                  <pic:blipFill>
+                    <a:blip r:embed="rId21"/>
+                    <a:stretch>
+                      <a:fillRect/>
+                    </a:stretch>
+                  </pic:blipFill>
+                  <pic:spPr>
+                    <a:xfrm>
+                      <a:off x="0" y="0"/>
+                      <a:ext cx="7543800" cy="9762565"/>
                     </a:xfrm>
                     <a:prstGeom prst="rect"/>
                   </pic:spPr>
@@ -708,13 +967,6 @@
     <w:name w:val="Normal"/>
     <w:qFormat/>
     <w:rsid w:val="00FC693F"/>
-    <w:pPr>
-      <w:spacing w:before="0" w:after="0"/>
-    </w:pPr>
-    <w:rPr>
-      <w:rFonts w:ascii="Arial" w:hAnsi="Arial"/>
-      <w:sz w:val="2"/>
-    </w:rPr>
   </w:style>
   <w:style w:type="paragraph" w:styleId="Header">
     <w:name w:val="header"/>

</xml_diff>